<commit_message>
Clarify Year 4 tax treatment in FM Mock 01 Q16
State that the balancing allowance replaces the 25% writing-down
allowance in the disposal year, and explain why in the rationale.

Co-Authored-By: Claude Opus 5.5 <noreply@anthropic.com>
Claude-Session: https://claude.ai/code/session_01Uvnmzg2pJDshYudjR7iNRh
</commit_message>
<xml_diff>
--- a/mock-exams/FM_Mock_Exam_01.docx
+++ b/mock-exams/FM_Mock_Exam_01.docx
@@ -3980,7 +3980,7 @@
         <w:spacing w:after="60"/>
       </w:pPr>
       <w:r>
-        <w:t xml:space="preserve">Orvelle Co can claim tax-allowable depreciation on a 25% reducing balance basis, with a balancing allowance or charge in the final year of operation.</w:t>
+        <w:t xml:space="preserve">Orvelle Co can claim tax-allowable depreciation on a 25% reducing balance basis in Years 1 to 3. In Year 4, the year of disposal, no 25% allowance is claimed; instead a balancing allowance or charge is calculated as the tax written-down value at the start of Year 4 less the disposal proceeds.</w:t>
       </w:r>
     </w:p>
     <w:p>
@@ -12875,6 +12875,15 @@
       </w:r>
       <w:r>
         <w:t xml:space="preserve"> because tax is paid one year in arrears.</w:t>
+      </w:r>
+    </w:p>
+    <w:p>
+      <w:pPr>
+        <w:keepNext w:val="false"/>
+        <w:spacing w:after="120" w:before="0"/>
+      </w:pPr>
+      <w:r>
+        <w:t xml:space="preserve">Why there is no 25% allowance in Year 4: in the year an asset is sold, the normal writing-down allowance is replaced by the balancing adjustment. The balancing allowance is the whole unrelieved balance (TWDV $168,750 less proceeds $40,000), so over the four years total relief is exactly cost less proceeds: 100,000 + 75,000 + 56,250 + 128,750 = $360,000 = 400,000 − 40,000. Claiming a Year 4 allowance of 168,750 × 25% = $42,188 as well would leave a balancing allowance of only $86,562, but total relief would still be $360,000.</w:t>
       </w:r>
     </w:p>
     <w:p>

</xml_diff>